<commit_message>
260713 Se añada datos de driver PROLIFIC 3.3.2.105 en el help
</commit_message>
<xml_diff>
--- a/Documentacion/ponderaHelp.docx
+++ b/Documentacion/ponderaHelp.docx
@@ -71,13 +71,7 @@
         <w:jc w:val="both"/>
       </w:pPr>
       <w:r>
-        <w:t>Guía operativa para capturar lecturas de balanza, configurar conexiones, usar recetas de lectura y</w:t>
-      </w:r>
-      <w:r>
-        <w:t xml:space="preserve"> </w:t>
-      </w:r>
-      <w:r>
-        <w:t>administrar la licencia demo u offline.</w:t>
+        <w:t>Guía operativa para capturar lecturas de balanza, configurar conexiones, usar recetas de lectura y administrar la licencia demo u offline.</w:t>
       </w:r>
     </w:p>
     <w:p>
@@ -256,6 +250,9 @@
         <w:jc w:val="both"/>
       </w:pPr>
       <w:r>
+        <w:rPr>
+          <w:noProof/>
+        </w:rPr>
         <w:lastRenderedPageBreak/>
         <w:drawing>
           <wp:inline distT="0" distB="0" distL="0" distR="0" wp14:anchorId="18D18AED" wp14:editId="292FC2D0">
@@ -362,6 +359,9 @@
         <w:jc w:val="both"/>
       </w:pPr>
       <w:r>
+        <w:rPr>
+          <w:noProof/>
+        </w:rPr>
         <w:drawing>
           <wp:inline distT="0" distB="0" distL="0" distR="0" wp14:anchorId="423DB15B" wp14:editId="7BBFC9EA">
             <wp:extent cx="5612130" cy="1267460"/>
@@ -409,6 +409,9 @@
         <w:jc w:val="both"/>
       </w:pPr>
       <w:r>
+        <w:rPr>
+          <w:noProof/>
+        </w:rPr>
         <w:drawing>
           <wp:inline distT="0" distB="0" distL="0" distR="0" wp14:anchorId="1BA302A9" wp14:editId="64BEA979">
             <wp:extent cx="2333752" cy="1683747"/>
@@ -929,6 +932,9 @@
         <w:jc w:val="both"/>
       </w:pPr>
       <w:r>
+        <w:rPr>
+          <w:noProof/>
+        </w:rPr>
         <w:drawing>
           <wp:inline distT="0" distB="0" distL="0" distR="0" wp14:anchorId="5C4DD405" wp14:editId="4B12CDB6">
             <wp:extent cx="5612130" cy="1301115"/>
@@ -1020,6 +1026,9 @@
         <w:jc w:val="both"/>
       </w:pPr>
       <w:r>
+        <w:rPr>
+          <w:noProof/>
+        </w:rPr>
         <w:drawing>
           <wp:inline distT="0" distB="0" distL="0" distR="0" wp14:anchorId="6C73FCBE" wp14:editId="3ABA6A6E">
             <wp:extent cx="5612130" cy="1730375"/>
@@ -1096,6 +1105,9 @@
         <w:jc w:val="both"/>
       </w:pPr>
       <w:r>
+        <w:rPr>
+          <w:noProof/>
+        </w:rPr>
         <w:drawing>
           <wp:inline distT="0" distB="0" distL="0" distR="0" wp14:anchorId="422D4B22" wp14:editId="0C64B0AE">
             <wp:extent cx="5612130" cy="3171825"/>
@@ -1140,6 +1152,25 @@
     </w:p>
     <w:p>
       <w:pPr>
+        <w:jc w:val="both"/>
+      </w:pPr>
+      <w:r>
+        <w:rPr>
+          <w:color w:val="EE0000"/>
+        </w:rPr>
+        <w:t>Problemas de conexión</w:t>
+      </w:r>
+      <w:r>
+        <w:t>: Si la conexión no se establece porque el PC no reconoce el puerto, es importante instalar el siguiente driver: PROLIFIC 3.3.2.105</w:t>
+      </w:r>
+    </w:p>
+    <w:p>
+      <w:pPr>
+        <w:jc w:val="both"/>
+      </w:pPr>
+    </w:p>
+    <w:p>
+      <w:pPr>
         <w:pStyle w:val="Ttulo2"/>
         <w:numPr>
           <w:ilvl w:val="0"/>
@@ -1272,7 +1303,6 @@
         <w:jc w:val="both"/>
       </w:pPr>
       <w:r>
-        <w:lastRenderedPageBreak/>
         <w:t>Ejemplo: entrada en kg y salida en g.</w:t>
       </w:r>
     </w:p>
@@ -1343,6 +1373,7 @@
       </w:pPr>
       <w:r>
         <w:rPr>
+          <w:noProof/>
           <w:lang w:val="es-ES_tradnl"/>
         </w:rPr>
         <w:drawing>
@@ -1574,6 +1605,7 @@
         <w:jc w:val="both"/>
       </w:pPr>
       <w:r>
+        <w:lastRenderedPageBreak/>
         <w:t>TCP: comprobar IP, puerto y conectividad.</w:t>
       </w:r>
     </w:p>
@@ -1612,7 +1644,6 @@
         <w:jc w:val="both"/>
       </w:pPr>
       <w:r>
-        <w:lastRenderedPageBreak/>
         <w:t>Falta de respuesta de la inteligencia arti</w:t>
       </w:r>
       <w:r>
@@ -1633,31 +1664,7 @@
           <w:rPr>
             <w:rStyle w:val="Hipervnculo"/>
           </w:rPr>
-          <w:t>enl</w:t>
-        </w:r>
-        <w:r>
-          <w:rPr>
-            <w:rStyle w:val="Hipervnculo"/>
-          </w:rPr>
-          <w:t>a</w:t>
-        </w:r>
-        <w:r>
-          <w:rPr>
-            <w:rStyle w:val="Hipervnculo"/>
-          </w:rPr>
-          <w:t>c</w:t>
-        </w:r>
-        <w:r>
-          <w:rPr>
-            <w:rStyle w:val="Hipervnculo"/>
-          </w:rPr>
-          <w:t>e</w:t>
-        </w:r>
-        <w:r>
-          <w:rPr>
-            <w:rStyle w:val="Hipervnculo"/>
-          </w:rPr>
-          <w:t>.</w:t>
+          <w:t>enlace.</w:t>
         </w:r>
       </w:hyperlink>
       <w:r>

</xml_diff>